<commit_message>
chore: finalize delivery package and member test coverage
</commit_message>
<xml_diff>
--- a/Docs/deliverables/report/first-brief-report.docx
+++ b/Docs/deliverables/report/first-brief-report.docx
@@ -2136,7 +2136,7 @@
         <w:widowControl w:val="0"/>
         <w:spacing w:after="120" w:line="240" w:lineRule="auto"/>
         <w:rPr>
-          <w:rFonts w:ascii="Times New Roman" w:eastAsia="等线" w:hAnsi="Times New Roman" w:cs="Times New Roman"/>
+          <w:rFonts w:ascii="Times New Roman" w:eastAsia="Arial" w:hAnsi="Times New Roman" w:cs="Times New Roman"/>
           <w:kern w:val="0"/>
           <w:lang w:val="en-US"/>
           <w14:ligatures w14:val="none"/>
@@ -2144,7 +2144,7 @@
       </w:pPr>
       <w:r>
         <w:rPr>
-          <w:rFonts w:ascii="Times New Roman" w:eastAsia="等线" w:hAnsi="Times New Roman" w:cs="Times New Roman"/>
+          <w:rFonts w:ascii="Times New Roman" w:eastAsia="Arial" w:hAnsi="Times New Roman" w:cs="Times New Roman"/>
           <w:kern w:val="0"/>
           <w:lang w:val="en-US"/>
           <w14:ligatures w14:val="none"/>
@@ -2153,7 +2153,7 @@
       </w:r>
       <w:r>
         <w:rPr>
-          <w:rFonts w:ascii="Times New Roman" w:eastAsia="等线" w:hAnsi="Times New Roman" w:cs="Times New Roman"/>
+          <w:rFonts w:ascii="Times New Roman" w:eastAsia="Arial" w:hAnsi="Times New Roman" w:cs="Times New Roman"/>
           <w:b/>
           <w:bCs/>
           <w:kern w:val="0"/>
@@ -2164,7 +2164,7 @@
       </w:r>
       <w:r>
         <w:rPr>
-          <w:rFonts w:ascii="Times New Roman" w:eastAsia="等线" w:hAnsi="Times New Roman" w:cs="Times New Roman"/>
+          <w:rFonts w:ascii="Times New Roman" w:eastAsia="Arial" w:hAnsi="Times New Roman" w:cs="Times New Roman"/>
           <w:kern w:val="0"/>
           <w:lang w:val="en-US"/>
           <w14:ligatures w14:val="none"/>
@@ -2216,7 +2216,7 @@
               <w:widowControl w:val="0"/>
               <w:spacing w:after="0" w:line="240" w:lineRule="auto"/>
               <w:rPr>
-                <w:rFonts w:ascii="Times New Roman" w:eastAsia="等线" w:hAnsi="Times New Roman" w:cs="Times New Roman"/>
+                <w:rFonts w:ascii="Times New Roman" w:eastAsia="Arial" w:hAnsi="Times New Roman" w:cs="Times New Roman"/>
                 <w:kern w:val="0"/>
                 <w:lang w:val="en-US"/>
                 <w14:ligatures w14:val="none"/>
@@ -2224,7 +2224,7 @@
             </w:pPr>
             <w:r>
               <w:rPr>
-                <w:rFonts w:ascii="Times New Roman" w:eastAsia="等线" w:hAnsi="Times New Roman" w:cs="Times New Roman"/>
+                <w:rFonts w:ascii="Times New Roman" w:eastAsia="Arial" w:hAnsi="Times New Roman" w:cs="Times New Roman"/>
                 <w:b/>
                 <w:bCs/>
                 <w:kern w:val="0"/>
@@ -2251,7 +2251,7 @@
               <w:widowControl w:val="0"/>
               <w:spacing w:after="0" w:line="240" w:lineRule="auto"/>
               <w:rPr>
-                <w:rFonts w:ascii="Times New Roman" w:eastAsia="等线" w:hAnsi="Times New Roman" w:cs="Times New Roman"/>
+                <w:rFonts w:ascii="Times New Roman" w:eastAsia="Arial" w:hAnsi="Times New Roman" w:cs="Times New Roman"/>
                 <w:kern w:val="0"/>
                 <w:lang w:val="en-US"/>
                 <w14:ligatures w14:val="none"/>
@@ -2259,7 +2259,7 @@
             </w:pPr>
             <w:r>
               <w:rPr>
-                <w:rFonts w:ascii="Times New Roman" w:eastAsia="等线" w:hAnsi="Times New Roman" w:cs="Times New Roman"/>
+                <w:rFonts w:ascii="Times New Roman" w:eastAsia="Arial" w:hAnsi="Times New Roman" w:cs="Times New Roman"/>
                 <w:b/>
                 <w:bCs/>
                 <w:kern w:val="0"/>
@@ -2288,7 +2288,7 @@
               <w:widowControl w:val="0"/>
               <w:spacing w:after="0" w:line="240" w:lineRule="auto"/>
               <w:rPr>
-                <w:rFonts w:ascii="Times New Roman" w:eastAsia="等线" w:hAnsi="Times New Roman" w:cs="Times New Roman"/>
+                <w:rFonts w:ascii="Times New Roman" w:eastAsia="Arial" w:hAnsi="Times New Roman" w:cs="Times New Roman"/>
                 <w:kern w:val="0"/>
                 <w:lang w:val="en-US"/>
                 <w14:ligatures w14:val="none"/>
@@ -2296,7 +2296,7 @@
             </w:pPr>
             <w:r>
               <w:rPr>
-                <w:rFonts w:ascii="Times New Roman" w:eastAsia="等线" w:hAnsi="Times New Roman" w:cs="Times New Roman"/>
+                <w:rFonts w:ascii="Times New Roman" w:eastAsia="Arial" w:hAnsi="Times New Roman" w:cs="Times New Roman"/>
                 <w:kern w:val="0"/>
                 <w:lang w:val="en-US"/>
                 <w14:ligatures w14:val="none"/>
@@ -2321,7 +2321,7 @@
               <w:widowControl w:val="0"/>
               <w:spacing w:after="0" w:line="240" w:lineRule="auto"/>
               <w:rPr>
-                <w:rFonts w:ascii="Times New Roman" w:eastAsia="等线" w:hAnsi="Times New Roman" w:cs="Times New Roman"/>
+                <w:rFonts w:ascii="Times New Roman" w:eastAsia="Arial" w:hAnsi="Times New Roman" w:cs="Times New Roman"/>
                 <w:kern w:val="0"/>
                 <w:lang w:val="en-US"/>
                 <w14:ligatures w14:val="none"/>
@@ -2329,7 +2329,7 @@
             </w:pPr>
             <w:r>
               <w:rPr>
-                <w:rFonts w:ascii="Times New Roman" w:eastAsia="等线" w:hAnsi="Times New Roman" w:cs="Times New Roman"/>
+                <w:rFonts w:ascii="Times New Roman" w:eastAsia="Arial" w:hAnsi="Times New Roman" w:cs="Times New Roman"/>
                 <w:kern w:val="0"/>
                 <w:lang w:val="en-US"/>
                 <w14:ligatures w14:val="none"/>
@@ -2356,7 +2356,7 @@
               <w:widowControl w:val="0"/>
               <w:spacing w:after="0" w:line="240" w:lineRule="auto"/>
               <w:rPr>
-                <w:rFonts w:ascii="Times New Roman" w:eastAsia="等线" w:hAnsi="Times New Roman" w:cs="Times New Roman"/>
+                <w:rFonts w:ascii="Times New Roman" w:eastAsia="Arial" w:hAnsi="Times New Roman" w:cs="Times New Roman"/>
                 <w:kern w:val="0"/>
                 <w:lang w:val="en-US"/>
                 <w14:ligatures w14:val="none"/>
@@ -2364,7 +2364,7 @@
             </w:pPr>
             <w:r>
               <w:rPr>
-                <w:rFonts w:ascii="Times New Roman" w:eastAsia="等线" w:hAnsi="Times New Roman" w:cs="Times New Roman"/>
+                <w:rFonts w:ascii="Times New Roman" w:eastAsia="Arial" w:hAnsi="Times New Roman" w:cs="Times New Roman"/>
                 <w:kern w:val="0"/>
                 <w:lang w:val="en-US"/>
                 <w14:ligatures w14:val="none"/>
@@ -2389,7 +2389,7 @@
               <w:widowControl w:val="0"/>
               <w:spacing w:after="0" w:line="240" w:lineRule="auto"/>
               <w:rPr>
-                <w:rFonts w:ascii="Times New Roman" w:eastAsia="等线" w:hAnsi="Times New Roman" w:cs="Times New Roman"/>
+                <w:rFonts w:ascii="Times New Roman" w:eastAsia="Arial" w:hAnsi="Times New Roman" w:cs="Times New Roman"/>
                 <w:kern w:val="0"/>
                 <w:lang w:val="en-US"/>
                 <w14:ligatures w14:val="none"/>
@@ -2397,7 +2397,7 @@
             </w:pPr>
             <w:r>
               <w:rPr>
-                <w:rFonts w:ascii="Times New Roman" w:eastAsia="等线" w:hAnsi="Times New Roman" w:cs="Times New Roman"/>
+                <w:rFonts w:ascii="Times New Roman" w:eastAsia="Arial" w:hAnsi="Times New Roman" w:cs="Times New Roman"/>
                 <w:kern w:val="0"/>
                 <w:lang w:val="en-US"/>
                 <w14:ligatures w14:val="none"/>
@@ -2424,7 +2424,7 @@
               <w:widowControl w:val="0"/>
               <w:spacing w:after="0" w:line="240" w:lineRule="auto"/>
               <w:rPr>
-                <w:rFonts w:ascii="Times New Roman" w:eastAsia="等线" w:hAnsi="Times New Roman" w:cs="Times New Roman"/>
+                <w:rFonts w:ascii="Times New Roman" w:eastAsia="Arial" w:hAnsi="Times New Roman" w:cs="Times New Roman"/>
                 <w:kern w:val="0"/>
                 <w:lang w:val="en-US"/>
                 <w14:ligatures w14:val="none"/>
@@ -2432,7 +2432,7 @@
             </w:pPr>
             <w:r>
               <w:rPr>
-                <w:rFonts w:ascii="Times New Roman" w:eastAsia="等线" w:hAnsi="Times New Roman" w:cs="Times New Roman"/>
+                <w:rFonts w:ascii="Times New Roman" w:eastAsia="Arial" w:hAnsi="Times New Roman" w:cs="Times New Roman"/>
                 <w:kern w:val="0"/>
                 <w:lang w:val="en-US"/>
                 <w14:ligatures w14:val="none"/>
@@ -2457,7 +2457,7 @@
               <w:widowControl w:val="0"/>
               <w:spacing w:after="0" w:line="240" w:lineRule="auto"/>
               <w:rPr>
-                <w:rFonts w:ascii="Times New Roman" w:eastAsia="等线" w:hAnsi="Times New Roman" w:cs="Times New Roman"/>
+                <w:rFonts w:ascii="Times New Roman" w:eastAsia="Arial" w:hAnsi="Times New Roman" w:cs="Times New Roman"/>
                 <w:kern w:val="0"/>
                 <w:lang w:val="en-US"/>
                 <w14:ligatures w14:val="none"/>
@@ -2465,7 +2465,7 @@
             </w:pPr>
             <w:r>
               <w:rPr>
-                <w:rFonts w:ascii="Times New Roman" w:eastAsia="等线" w:hAnsi="Times New Roman" w:cs="Times New Roman"/>
+                <w:rFonts w:ascii="Times New Roman" w:eastAsia="Arial" w:hAnsi="Times New Roman" w:cs="Times New Roman"/>
                 <w:kern w:val="0"/>
                 <w:lang w:val="en-US"/>
                 <w14:ligatures w14:val="none"/>
@@ -2492,7 +2492,7 @@
               <w:widowControl w:val="0"/>
               <w:spacing w:after="0" w:line="240" w:lineRule="auto"/>
               <w:rPr>
-                <w:rFonts w:ascii="Times New Roman" w:eastAsia="等线" w:hAnsi="Times New Roman" w:cs="Times New Roman"/>
+                <w:rFonts w:ascii="Times New Roman" w:eastAsia="Arial" w:hAnsi="Times New Roman" w:cs="Times New Roman"/>
                 <w:kern w:val="0"/>
                 <w:lang w:val="en-US"/>
                 <w14:ligatures w14:val="none"/>
@@ -2500,7 +2500,7 @@
             </w:pPr>
             <w:r>
               <w:rPr>
-                <w:rFonts w:ascii="Times New Roman" w:eastAsia="等线" w:hAnsi="Times New Roman" w:cs="Times New Roman"/>
+                <w:rFonts w:ascii="Times New Roman" w:eastAsia="Arial" w:hAnsi="Times New Roman" w:cs="Times New Roman"/>
                 <w:kern w:val="0"/>
                 <w:lang w:val="en-US"/>
                 <w14:ligatures w14:val="none"/>
@@ -2525,7 +2525,7 @@
               <w:widowControl w:val="0"/>
               <w:spacing w:after="0" w:line="240" w:lineRule="auto"/>
               <w:rPr>
-                <w:rFonts w:ascii="Times New Roman" w:eastAsia="等线" w:hAnsi="Times New Roman" w:cs="Times New Roman"/>
+                <w:rFonts w:ascii="Times New Roman" w:eastAsia="Arial" w:hAnsi="Times New Roman" w:cs="Times New Roman"/>
                 <w:kern w:val="0"/>
                 <w:lang w:val="en-US"/>
                 <w14:ligatures w14:val="none"/>
@@ -2533,7 +2533,7 @@
             </w:pPr>
             <w:r>
               <w:rPr>
-                <w:rFonts w:ascii="Times New Roman" w:eastAsia="等线" w:hAnsi="Times New Roman" w:cs="Times New Roman"/>
+                <w:rFonts w:ascii="Times New Roman" w:eastAsia="Arial" w:hAnsi="Times New Roman" w:cs="Times New Roman"/>
                 <w:kern w:val="0"/>
                 <w:lang w:val="en-US"/>
                 <w14:ligatures w14:val="none"/>
@@ -2549,7 +2549,7 @@
         <w:widowControl w:val="0"/>
         <w:spacing w:after="120" w:line="240" w:lineRule="auto"/>
         <w:rPr>
-          <w:rFonts w:ascii="Times New Roman" w:eastAsia="等线" w:hAnsi="Times New Roman" w:cs="Times New Roman"/>
+          <w:rFonts w:ascii="Times New Roman" w:eastAsia="Arial" w:hAnsi="Times New Roman" w:cs="Times New Roman"/>
           <w:kern w:val="0"/>
           <w:lang w:val="en-US"/>
           <w14:ligatures w14:val="none"/>
@@ -2557,7 +2557,7 @@
       </w:pPr>
       <w:r>
         <w:rPr>
-          <w:rFonts w:ascii="Times New Roman" w:eastAsia="等线" w:hAnsi="Times New Roman" w:cs="Times New Roman"/>
+          <w:rFonts w:ascii="Times New Roman" w:eastAsia="Arial" w:hAnsi="Times New Roman" w:cs="Times New Roman"/>
           <w:b/>
           <w:bCs/>
           <w:kern w:val="0"/>
@@ -2572,7 +2572,7 @@
         <w:widowControl w:val="0"/>
         <w:spacing w:after="200" w:line="240" w:lineRule="auto"/>
         <w:rPr>
-          <w:rFonts w:ascii="Times New Roman" w:eastAsia="等线" w:hAnsi="Times New Roman" w:cs="Times New Roman"/>
+          <w:rFonts w:ascii="Times New Roman" w:eastAsia="Arial" w:hAnsi="Times New Roman" w:cs="Times New Roman"/>
           <w:kern w:val="0"/>
           <w:lang w:val="en-US"/>
           <w14:ligatures w14:val="none"/>
@@ -2580,7 +2580,7 @@
       </w:pPr>
       <w:r>
         <w:rPr>
-          <w:rFonts w:ascii="Times New Roman" w:eastAsia="等线" w:hAnsi="Times New Roman" w:cs="Times New Roman"/>
+          <w:rFonts w:ascii="Times New Roman" w:eastAsia="Arial" w:hAnsi="Times New Roman" w:cs="Times New Roman"/>
           <w:kern w:val="0"/>
           <w:lang w:val="en-US"/>
           <w14:ligatures w14:val="none"/>
@@ -2633,7 +2633,7 @@
               <w:widowControl w:val="0"/>
               <w:spacing w:after="0" w:line="240" w:lineRule="auto"/>
               <w:rPr>
-                <w:rFonts w:ascii="Times New Roman" w:eastAsia="等线" w:hAnsi="Times New Roman" w:cs="Times New Roman"/>
+                <w:rFonts w:ascii="Times New Roman" w:eastAsia="Arial" w:hAnsi="Times New Roman" w:cs="Times New Roman"/>
                 <w:kern w:val="0"/>
                 <w:lang w:val="en-US"/>
                 <w14:ligatures w14:val="none"/>
@@ -2641,7 +2641,7 @@
             </w:pPr>
             <w:r>
               <w:rPr>
-                <w:rFonts w:ascii="Times New Roman" w:eastAsia="等线" w:hAnsi="Times New Roman" w:cs="Times New Roman"/>
+                <w:rFonts w:ascii="Times New Roman" w:eastAsia="Arial" w:hAnsi="Times New Roman" w:cs="Times New Roman"/>
                 <w:b/>
                 <w:bCs/>
                 <w:kern w:val="0"/>
@@ -2668,7 +2668,7 @@
               <w:widowControl w:val="0"/>
               <w:spacing w:after="0" w:line="240" w:lineRule="auto"/>
               <w:rPr>
-                <w:rFonts w:ascii="Times New Roman" w:eastAsia="等线" w:hAnsi="Times New Roman" w:cs="Times New Roman"/>
+                <w:rFonts w:ascii="Times New Roman" w:eastAsia="Arial" w:hAnsi="Times New Roman" w:cs="Times New Roman"/>
                 <w:kern w:val="0"/>
                 <w:lang w:val="en-US"/>
                 <w14:ligatures w14:val="none"/>
@@ -2676,7 +2676,7 @@
             </w:pPr>
             <w:r>
               <w:rPr>
-                <w:rFonts w:ascii="Times New Roman" w:eastAsia="等线" w:hAnsi="Times New Roman" w:cs="Times New Roman"/>
+                <w:rFonts w:ascii="Times New Roman" w:eastAsia="Arial" w:hAnsi="Times New Roman" w:cs="Times New Roman"/>
                 <w:b/>
                 <w:bCs/>
                 <w:kern w:val="0"/>
@@ -2703,7 +2703,7 @@
               <w:widowControl w:val="0"/>
               <w:spacing w:after="0" w:line="240" w:lineRule="auto"/>
               <w:rPr>
-                <w:rFonts w:ascii="Times New Roman" w:eastAsia="等线" w:hAnsi="Times New Roman" w:cs="Times New Roman"/>
+                <w:rFonts w:ascii="Times New Roman" w:eastAsia="Arial" w:hAnsi="Times New Roman" w:cs="Times New Roman"/>
                 <w:kern w:val="0"/>
                 <w:lang w:val="en-US"/>
                 <w14:ligatures w14:val="none"/>
@@ -2711,7 +2711,7 @@
             </w:pPr>
             <w:r>
               <w:rPr>
-                <w:rFonts w:ascii="Times New Roman" w:eastAsia="等线" w:hAnsi="Times New Roman" w:cs="Times New Roman"/>
+                <w:rFonts w:ascii="Times New Roman" w:eastAsia="Arial" w:hAnsi="Times New Roman" w:cs="Times New Roman"/>
                 <w:b/>
                 <w:bCs/>
                 <w:kern w:val="0"/>
@@ -2740,7 +2740,7 @@
               <w:widowControl w:val="0"/>
               <w:spacing w:after="0" w:line="240" w:lineRule="auto"/>
               <w:rPr>
-                <w:rFonts w:ascii="Times New Roman" w:eastAsia="等线" w:hAnsi="Times New Roman" w:cs="Times New Roman"/>
+                <w:rFonts w:ascii="Times New Roman" w:eastAsia="Arial" w:hAnsi="Times New Roman" w:cs="Times New Roman"/>
                 <w:kern w:val="0"/>
                 <w:lang w:val="en-US"/>
                 <w14:ligatures w14:val="none"/>
@@ -2748,7 +2748,7 @@
             </w:pPr>
             <w:r>
               <w:rPr>
-                <w:rFonts w:ascii="Times New Roman" w:eastAsia="等线" w:hAnsi="Times New Roman" w:cs="Times New Roman"/>
+                <w:rFonts w:ascii="Times New Roman" w:eastAsia="Arial" w:hAnsi="Times New Roman" w:cs="Times New Roman"/>
                 <w:kern w:val="0"/>
                 <w:lang w:val="en-US"/>
                 <w14:ligatures w14:val="none"/>
@@ -2773,7 +2773,7 @@
               <w:widowControl w:val="0"/>
               <w:spacing w:after="0" w:line="240" w:lineRule="auto"/>
               <w:rPr>
-                <w:rFonts w:ascii="Times New Roman" w:eastAsia="等线" w:hAnsi="Times New Roman" w:cs="Times New Roman"/>
+                <w:rFonts w:ascii="Times New Roman" w:eastAsia="Arial" w:hAnsi="Times New Roman" w:cs="Times New Roman"/>
                 <w:kern w:val="0"/>
                 <w:lang w:val="en-US"/>
                 <w14:ligatures w14:val="none"/>
@@ -2781,7 +2781,7 @@
             </w:pPr>
             <w:r>
               <w:rPr>
-                <w:rFonts w:ascii="Times New Roman" w:eastAsia="等线" w:hAnsi="Times New Roman" w:cs="Times New Roman"/>
+                <w:rFonts w:ascii="Times New Roman" w:eastAsia="Arial" w:hAnsi="Times New Roman" w:cs="Times New Roman"/>
                 <w:kern w:val="0"/>
                 <w:lang w:val="en-US"/>
                 <w14:ligatures w14:val="none"/>
@@ -2806,7 +2806,7 @@
               <w:widowControl w:val="0"/>
               <w:spacing w:after="0" w:line="240" w:lineRule="auto"/>
               <w:rPr>
-                <w:rFonts w:ascii="Times New Roman" w:eastAsia="等线" w:hAnsi="Times New Roman" w:cs="Times New Roman"/>
+                <w:rFonts w:ascii="Times New Roman" w:eastAsia="Arial" w:hAnsi="Times New Roman" w:cs="Times New Roman"/>
                 <w:kern w:val="0"/>
                 <w:lang w:val="en-US"/>
                 <w14:ligatures w14:val="none"/>
@@ -2814,7 +2814,7 @@
             </w:pPr>
             <w:r>
               <w:rPr>
-                <w:rFonts w:ascii="Times New Roman" w:eastAsia="等线" w:hAnsi="Times New Roman" w:cs="Times New Roman"/>
+                <w:rFonts w:ascii="Times New Roman" w:eastAsia="Arial" w:hAnsi="Times New Roman" w:cs="Times New Roman"/>
                 <w:kern w:val="0"/>
                 <w:lang w:val="en-US"/>
                 <w14:ligatures w14:val="none"/>
@@ -2841,7 +2841,7 @@
               <w:widowControl w:val="0"/>
               <w:spacing w:after="0" w:line="240" w:lineRule="auto"/>
               <w:rPr>
-                <w:rFonts w:ascii="Times New Roman" w:eastAsia="等线" w:hAnsi="Times New Roman" w:cs="Times New Roman"/>
+                <w:rFonts w:ascii="Times New Roman" w:eastAsia="Arial" w:hAnsi="Times New Roman" w:cs="Times New Roman"/>
                 <w:kern w:val="0"/>
                 <w:lang w:val="en-US"/>
                 <w14:ligatures w14:val="none"/>
@@ -2849,7 +2849,7 @@
             </w:pPr>
             <w:r>
               <w:rPr>
-                <w:rFonts w:ascii="Times New Roman" w:eastAsia="等线" w:hAnsi="Times New Roman" w:cs="Times New Roman"/>
+                <w:rFonts w:ascii="Times New Roman" w:eastAsia="Arial" w:hAnsi="Times New Roman" w:cs="Times New Roman"/>
                 <w:kern w:val="0"/>
                 <w:lang w:val="en-US"/>
                 <w14:ligatures w14:val="none"/>
@@ -2874,7 +2874,7 @@
               <w:widowControl w:val="0"/>
               <w:spacing w:after="0" w:line="240" w:lineRule="auto"/>
               <w:rPr>
-                <w:rFonts w:ascii="Times New Roman" w:eastAsia="等线" w:hAnsi="Times New Roman" w:cs="Times New Roman"/>
+                <w:rFonts w:ascii="Times New Roman" w:eastAsia="Arial" w:hAnsi="Times New Roman" w:cs="Times New Roman"/>
                 <w:kern w:val="0"/>
                 <w:lang w:val="en-US"/>
                 <w14:ligatures w14:val="none"/>
@@ -2882,7 +2882,7 @@
             </w:pPr>
             <w:r>
               <w:rPr>
-                <w:rFonts w:ascii="Times New Roman" w:eastAsia="等线" w:hAnsi="Times New Roman" w:cs="Times New Roman"/>
+                <w:rFonts w:ascii="Times New Roman" w:eastAsia="Arial" w:hAnsi="Times New Roman" w:cs="Times New Roman"/>
                 <w:kern w:val="0"/>
                 <w:lang w:val="en-US"/>
                 <w14:ligatures w14:val="none"/>
@@ -2907,7 +2907,7 @@
               <w:widowControl w:val="0"/>
               <w:spacing w:after="0" w:line="240" w:lineRule="auto"/>
               <w:rPr>
-                <w:rFonts w:ascii="Times New Roman" w:eastAsia="等线" w:hAnsi="Times New Roman" w:cs="Times New Roman"/>
+                <w:rFonts w:ascii="Times New Roman" w:eastAsia="Arial" w:hAnsi="Times New Roman" w:cs="Times New Roman"/>
                 <w:kern w:val="0"/>
                 <w:lang w:val="en-US"/>
                 <w14:ligatures w14:val="none"/>
@@ -2915,7 +2915,7 @@
             </w:pPr>
             <w:r>
               <w:rPr>
-                <w:rFonts w:ascii="Times New Roman" w:eastAsia="等线" w:hAnsi="Times New Roman" w:cs="Times New Roman"/>
+                <w:rFonts w:ascii="Times New Roman" w:eastAsia="Arial" w:hAnsi="Times New Roman" w:cs="Times New Roman"/>
                 <w:kern w:val="0"/>
                 <w:lang w:val="en-US"/>
                 <w14:ligatures w14:val="none"/>
@@ -2942,7 +2942,7 @@
               <w:widowControl w:val="0"/>
               <w:spacing w:after="0" w:line="240" w:lineRule="auto"/>
               <w:rPr>
-                <w:rFonts w:ascii="Times New Roman" w:eastAsia="等线" w:hAnsi="Times New Roman" w:cs="Times New Roman"/>
+                <w:rFonts w:ascii="Times New Roman" w:eastAsia="Arial" w:hAnsi="Times New Roman" w:cs="Times New Roman"/>
                 <w:kern w:val="0"/>
                 <w:lang w:val="en-US"/>
                 <w14:ligatures w14:val="none"/>
@@ -2950,7 +2950,7 @@
             </w:pPr>
             <w:r>
               <w:rPr>
-                <w:rFonts w:ascii="Times New Roman" w:eastAsia="等线" w:hAnsi="Times New Roman" w:cs="Times New Roman"/>
+                <w:rFonts w:ascii="Times New Roman" w:eastAsia="Arial" w:hAnsi="Times New Roman" w:cs="Times New Roman"/>
                 <w:kern w:val="0"/>
                 <w:lang w:val="en-US"/>
                 <w14:ligatures w14:val="none"/>
@@ -2975,7 +2975,7 @@
               <w:widowControl w:val="0"/>
               <w:spacing w:after="0" w:line="240" w:lineRule="auto"/>
               <w:rPr>
-                <w:rFonts w:ascii="Times New Roman" w:eastAsia="等线" w:hAnsi="Times New Roman" w:cs="Times New Roman"/>
+                <w:rFonts w:ascii="Times New Roman" w:eastAsia="Arial" w:hAnsi="Times New Roman" w:cs="Times New Roman"/>
                 <w:kern w:val="0"/>
                 <w:lang w:val="en-US"/>
                 <w14:ligatures w14:val="none"/>
@@ -2983,7 +2983,7 @@
             </w:pPr>
             <w:r>
               <w:rPr>
-                <w:rFonts w:ascii="Times New Roman" w:eastAsia="等线" w:hAnsi="Times New Roman" w:cs="Times New Roman"/>
+                <w:rFonts w:ascii="Times New Roman" w:eastAsia="Arial" w:hAnsi="Times New Roman" w:cs="Times New Roman"/>
                 <w:kern w:val="0"/>
                 <w:lang w:val="en-US"/>
                 <w14:ligatures w14:val="none"/>
@@ -3008,7 +3008,7 @@
               <w:widowControl w:val="0"/>
               <w:spacing w:after="0" w:line="240" w:lineRule="auto"/>
               <w:rPr>
-                <w:rFonts w:ascii="Times New Roman" w:eastAsia="等线" w:hAnsi="Times New Roman" w:cs="Times New Roman"/>
+                <w:rFonts w:ascii="Times New Roman" w:eastAsia="Arial" w:hAnsi="Times New Roman" w:cs="Times New Roman"/>
                 <w:kern w:val="0"/>
                 <w:lang w:val="en-US"/>
                 <w14:ligatures w14:val="none"/>
@@ -3016,7 +3016,7 @@
             </w:pPr>
             <w:r>
               <w:rPr>
-                <w:rFonts w:ascii="Times New Roman" w:eastAsia="等线" w:hAnsi="Times New Roman" w:cs="Times New Roman"/>
+                <w:rFonts w:ascii="Times New Roman" w:eastAsia="Arial" w:hAnsi="Times New Roman" w:cs="Times New Roman"/>
                 <w:kern w:val="0"/>
                 <w:lang w:val="en-US"/>
                 <w14:ligatures w14:val="none"/>
@@ -3043,7 +3043,7 @@
               <w:widowControl w:val="0"/>
               <w:spacing w:after="0" w:line="240" w:lineRule="auto"/>
               <w:rPr>
-                <w:rFonts w:ascii="Times New Roman" w:eastAsia="等线" w:hAnsi="Times New Roman" w:cs="Times New Roman"/>
+                <w:rFonts w:ascii="Times New Roman" w:eastAsia="Arial" w:hAnsi="Times New Roman" w:cs="Times New Roman"/>
                 <w:kern w:val="0"/>
                 <w:lang w:val="en-US"/>
                 <w14:ligatures w14:val="none"/>
@@ -3051,7 +3051,7 @@
             </w:pPr>
             <w:r>
               <w:rPr>
-                <w:rFonts w:ascii="Times New Roman" w:eastAsia="等线" w:hAnsi="Times New Roman" w:cs="Times New Roman"/>
+                <w:rFonts w:ascii="Times New Roman" w:eastAsia="Arial" w:hAnsi="Times New Roman" w:cs="Times New Roman"/>
                 <w:kern w:val="0"/>
                 <w:lang w:val="en-US"/>
                 <w14:ligatures w14:val="none"/>
@@ -3076,7 +3076,7 @@
               <w:widowControl w:val="0"/>
               <w:spacing w:after="0" w:line="240" w:lineRule="auto"/>
               <w:rPr>
-                <w:rFonts w:ascii="Times New Roman" w:eastAsia="等线" w:hAnsi="Times New Roman" w:cs="Times New Roman"/>
+                <w:rFonts w:ascii="Times New Roman" w:eastAsia="Arial" w:hAnsi="Times New Roman" w:cs="Times New Roman"/>
                 <w:kern w:val="0"/>
                 <w:lang w:val="en-US"/>
                 <w14:ligatures w14:val="none"/>
@@ -3084,7 +3084,7 @@
             </w:pPr>
             <w:r>
               <w:rPr>
-                <w:rFonts w:ascii="Times New Roman" w:eastAsia="等线" w:hAnsi="Times New Roman" w:cs="Times New Roman"/>
+                <w:rFonts w:ascii="Times New Roman" w:eastAsia="Arial" w:hAnsi="Times New Roman" w:cs="Times New Roman"/>
                 <w:kern w:val="0"/>
                 <w:lang w:val="en-US"/>
                 <w14:ligatures w14:val="none"/>
@@ -3109,7 +3109,7 @@
               <w:widowControl w:val="0"/>
               <w:spacing w:after="0" w:line="240" w:lineRule="auto"/>
               <w:rPr>
-                <w:rFonts w:ascii="Times New Roman" w:eastAsia="等线" w:hAnsi="Times New Roman" w:cs="Times New Roman"/>
+                <w:rFonts w:ascii="Times New Roman" w:eastAsia="Arial" w:hAnsi="Times New Roman" w:cs="Times New Roman"/>
                 <w:kern w:val="0"/>
                 <w:lang w:val="en-US"/>
                 <w14:ligatures w14:val="none"/>
@@ -3117,7 +3117,7 @@
             </w:pPr>
             <w:r>
               <w:rPr>
-                <w:rFonts w:ascii="Times New Roman" w:eastAsia="等线" w:hAnsi="Times New Roman" w:cs="Times New Roman"/>
+                <w:rFonts w:ascii="Times New Roman" w:eastAsia="Arial" w:hAnsi="Times New Roman" w:cs="Times New Roman"/>
                 <w:kern w:val="0"/>
                 <w:lang w:val="en-US"/>
                 <w14:ligatures w14:val="none"/>
@@ -4594,7 +4594,7 @@
     <w:unhideWhenUsed/>
   </w:style>
   <w:style w:type="character" w:customStyle="1" w:styleId="10">
-    <w:name w:val="标题 1 字符"/>
+    <w:name w:val="Heading 1 Char"/>
     <w:basedOn w:val="a0"/>
     <w:link w:val="1"/>
     <w:uiPriority w:val="9"/>
@@ -4607,7 +4607,7 @@
     </w:rPr>
   </w:style>
   <w:style w:type="character" w:customStyle="1" w:styleId="20">
-    <w:name w:val="标题 2 字符"/>
+    <w:name w:val="Heading 2 Char"/>
     <w:basedOn w:val="a0"/>
     <w:link w:val="2"/>
     <w:uiPriority w:val="9"/>
@@ -4620,7 +4620,7 @@
     </w:rPr>
   </w:style>
   <w:style w:type="character" w:customStyle="1" w:styleId="30">
-    <w:name w:val="标题 3 字符"/>
+    <w:name w:val="Heading 3 Char"/>
     <w:basedOn w:val="a0"/>
     <w:link w:val="3"/>
     <w:uiPriority w:val="9"/>
@@ -4633,7 +4633,7 @@
     </w:rPr>
   </w:style>
   <w:style w:type="character" w:customStyle="1" w:styleId="40">
-    <w:name w:val="标题 4 字符"/>
+    <w:name w:val="Heading 4 Char"/>
     <w:basedOn w:val="a0"/>
     <w:link w:val="4"/>
     <w:uiPriority w:val="9"/>
@@ -4646,7 +4646,7 @@
     </w:rPr>
   </w:style>
   <w:style w:type="character" w:customStyle="1" w:styleId="50">
-    <w:name w:val="标题 5 字符"/>
+    <w:name w:val="Heading 5 Char"/>
     <w:basedOn w:val="a0"/>
     <w:link w:val="5"/>
     <w:uiPriority w:val="9"/>
@@ -4658,7 +4658,7 @@
     </w:rPr>
   </w:style>
   <w:style w:type="character" w:customStyle="1" w:styleId="60">
-    <w:name w:val="标题 6 字符"/>
+    <w:name w:val="Heading 6 Char"/>
     <w:basedOn w:val="a0"/>
     <w:link w:val="6"/>
     <w:uiPriority w:val="9"/>
@@ -4672,7 +4672,7 @@
     </w:rPr>
   </w:style>
   <w:style w:type="character" w:customStyle="1" w:styleId="70">
-    <w:name w:val="标题 7 字符"/>
+    <w:name w:val="Heading 7 Char"/>
     <w:basedOn w:val="a0"/>
     <w:link w:val="7"/>
     <w:uiPriority w:val="9"/>
@@ -4684,7 +4684,7 @@
     </w:rPr>
   </w:style>
   <w:style w:type="character" w:customStyle="1" w:styleId="80">
-    <w:name w:val="标题 8 字符"/>
+    <w:name w:val="Heading 8 Char"/>
     <w:basedOn w:val="a0"/>
     <w:link w:val="8"/>
     <w:uiPriority w:val="9"/>
@@ -4698,7 +4698,7 @@
     </w:rPr>
   </w:style>
   <w:style w:type="character" w:customStyle="1" w:styleId="90">
-    <w:name w:val="标题 9 字符"/>
+    <w:name w:val="Heading 9 Char"/>
     <w:basedOn w:val="a0"/>
     <w:link w:val="9"/>
     <w:uiPriority w:val="9"/>
@@ -4730,7 +4730,7 @@
     </w:rPr>
   </w:style>
   <w:style w:type="character" w:customStyle="1" w:styleId="a4">
-    <w:name w:val="标题 字符"/>
+    <w:name w:val="Title Char"/>
     <w:basedOn w:val="a0"/>
     <w:link w:val="a3"/>
     <w:uiPriority w:val="10"/>
@@ -4765,7 +4765,7 @@
     </w:rPr>
   </w:style>
   <w:style w:type="character" w:customStyle="1" w:styleId="a6">
-    <w:name w:val="副标题 字符"/>
+    <w:name w:val="Subtitle Char"/>
     <w:basedOn w:val="a0"/>
     <w:link w:val="a5"/>
     <w:uiPriority w:val="11"/>
@@ -4797,7 +4797,7 @@
     </w:rPr>
   </w:style>
   <w:style w:type="character" w:customStyle="1" w:styleId="a8">
-    <w:name w:val="引用 字符"/>
+    <w:name w:val="Quote Char"/>
     <w:basedOn w:val="a0"/>
     <w:link w:val="a7"/>
     <w:uiPriority w:val="29"/>
@@ -4854,7 +4854,7 @@
     </w:rPr>
   </w:style>
   <w:style w:type="character" w:customStyle="1" w:styleId="ac">
-    <w:name w:val="明显引用 字符"/>
+    <w:name w:val="Intense Quote Char"/>
     <w:basedOn w:val="a0"/>
     <w:link w:val="ab"/>
     <w:uiPriority w:val="30"/>
@@ -4914,7 +4914,7 @@
     </w:pPr>
   </w:style>
   <w:style w:type="character" w:customStyle="1" w:styleId="af0">
-    <w:name w:val="页眉 字符"/>
+    <w:name w:val="Header Char"/>
     <w:basedOn w:val="a0"/>
     <w:link w:val="af"/>
     <w:uiPriority w:val="99"/>
@@ -4936,7 +4936,7 @@
     </w:pPr>
   </w:style>
   <w:style w:type="character" w:customStyle="1" w:styleId="af2">
-    <w:name w:val="页脚 字符"/>
+    <w:name w:val="Footer Char"/>
     <w:basedOn w:val="a0"/>
     <w:link w:val="af1"/>
     <w:uiPriority w:val="99"/>
@@ -4991,10 +4991,10 @@
         <a:latin typeface="Aptos Display" panose="02110004020202020204"/>
         <a:ea typeface=""/>
         <a:cs typeface=""/>
-        <a:font script="Jpan" typeface="游ゴシック Light"/>
+        <a:font script="Jpan" typeface="Arial"/>
         <a:font script="Hang" typeface="맑은 고딕"/>
-        <a:font script="Hans" typeface="等线 Light"/>
-        <a:font script="Hant" typeface="新細明體"/>
+        <a:font script="Hans" typeface="Arial"/>
+        <a:font script="Hant" typeface="Arial"/>
         <a:font script="Arab" typeface="Times New Roman"/>
         <a:font script="Hebr" typeface="Times New Roman"/>
         <a:font script="Thai" typeface="Angsana New"/>
@@ -5043,10 +5043,10 @@
         <a:latin typeface="Aptos" panose="02110004020202020204"/>
         <a:ea typeface=""/>
         <a:cs typeface=""/>
-        <a:font script="Jpan" typeface="游ゴシック"/>
+        <a:font script="Jpan" typeface="Arial"/>
         <a:font script="Hang" typeface="맑은 고딕"/>
-        <a:font script="Hans" typeface="等线"/>
-        <a:font script="Hant" typeface="新細明體"/>
+        <a:font script="Hans" typeface="Arial"/>
+        <a:font script="Hant" typeface="Arial"/>
         <a:font script="Arab" typeface="Arial"/>
         <a:font script="Hebr" typeface="Arial"/>
         <a:font script="Thai" typeface="Cordia New"/>

</xml_diff>